<commit_message>
Word edition of DOC-F17 and the P1-P2 volume with the job catalogue note
Claude-Session: https://claude.ai/code/session_012HHcRrzuvMBTL2FYxXtsyv
</commit_message>
<xml_diff>
--- a/treasury-platform/docs/30-readiness/word/DOC-F17-async-events-outbox-jobs-notifications.docx
+++ b/treasury-platform/docs/30-readiness/word/DOC-F17-async-events-outbox-jobs-notifications.docx
@@ -909,6 +909,114 @@
     <w:p>
       <w:r>
         <w:br w:type="page"/>
+      </w:r>
+    </w:p>
+    <w:p>
+      <w:pPr>
+        <w:pBdr>
+          <w:top w:val="single" w:color="E8C766" w:sz="6" w:space="6"/>
+          <w:left w:val="single" w:color="E8C766" w:sz="6" w:space="6"/>
+          <w:bottom w:val="single" w:color="E8C766" w:sz="6" w:space="6"/>
+          <w:right w:val="single" w:color="E8C766" w:sz="6" w:space="6"/>
+        </w:pBdr>
+        <w:shd w:fill="FFF8E1" w:color="auto" w:val="clear"/>
+        <w:bidi/>
+        <w:spacing w:after="160" w:before="60" w:line="300"/>
+        <w:ind w:left="140" w:right="140"/>
+      </w:pPr>
+      <w:r>
+        <w:rPr>
+          <w:rFonts w:ascii="Arial" w:cs="Arial" w:eastAsia="Arial" w:hAnsi="Arial"/>
+          <w:b/>
+          <w:bCs/>
+          <w:sz w:val="20"/>
+          <w:szCs w:val="20"/>
+          <w:rtl/>
+        </w:rPr>
+        <w:t xml:space="preserve">تحديث التنفيذ (2026-10-12):</w:t>
+      </w:r>
+      <w:r>
+        <w:rPr>
+          <w:rFonts w:ascii="Arial" w:cs="Arial" w:eastAsia="Arial" w:hAnsi="Arial"/>
+          <w:b w:val="false"/>
+          <w:bCs w:val="false"/>
+          <w:sz w:val="20"/>
+          <w:szCs w:val="20"/>
+          <w:rtl/>
+        </w:rPr>
+        <w:t xml:space="preserve"> قائمة JobKey المغلقة (DQ-F17-2) جدول </w:t>
+      </w:r>
+      <w:r>
+        <w:rPr>
+          <w:rFonts w:ascii="Courier New" w:cs="Courier New" w:eastAsia="Courier New" w:hAnsi="Courier New"/>
+          <w:b w:val="false"/>
+          <w:bCs w:val="false"/>
+          <w:color w:val="1F2937"/>
+          <w:sz w:val="18"/>
+          <w:szCs w:val="18"/>
+          <w:shd w:fill="F1F3F5" w:color="auto" w:val="clear"/>
+          <w:rtl/>
+        </w:rPr>
+        <w:t xml:space="preserve">‎cfg.JobDefinition‎</w:t>
+      </w:r>
+      <w:r>
+        <w:rPr>
+          <w:rFonts w:ascii="Arial" w:cs="Arial" w:eastAsia="Arial" w:hAnsi="Arial"/>
+          <w:b w:val="false"/>
+          <w:bCs w:val="false"/>
+          <w:sz w:val="20"/>
+          <w:szCs w:val="20"/>
+          <w:rtl/>
+        </w:rPr>
+        <w:t xml:space="preserve"> مبذور بالمهام التسع والعشرين في §5.2 ومعها JOB-PLT-ONBOARD، بنطاق كل مهمة وحالات المشترك المسموحة، و</w:t>
+      </w:r>
+      <w:r>
+        <w:rPr>
+          <w:rFonts w:ascii="Courier New" w:cs="Courier New" w:eastAsia="Courier New" w:hAnsi="Courier New"/>
+          <w:b w:val="false"/>
+          <w:bCs w:val="false"/>
+          <w:color w:val="1F2937"/>
+          <w:sz w:val="18"/>
+          <w:szCs w:val="18"/>
+          <w:shd w:fill="F1F3F5" w:color="auto" w:val="clear"/>
+          <w:rtl/>
+        </w:rPr>
+        <w:t xml:space="preserve">‎sec.usp_SetJobContext‎</w:t>
+      </w:r>
+      <w:r>
+        <w:rPr>
+          <w:rFonts w:ascii="Arial" w:cs="Arial" w:eastAsia="Arial" w:hAnsi="Arial"/>
+          <w:b w:val="false"/>
+          <w:bCs w:val="false"/>
+          <w:sz w:val="20"/>
+          <w:szCs w:val="20"/>
+          <w:rtl/>
+        </w:rPr>
+        <w:t xml:space="preserve"> يرفض غيرها (docs/adr/0004-platform-access-jobs-and-onboarding.md، db/static/037_job_context.sql؛ الاختبارات J1 إلى J6). ومهمتا JOB-PLT-TRIAL-EXPIRE وJOB-PLT-ARCHIVE تستدعيان </w:t>
+      </w:r>
+      <w:r>
+        <w:rPr>
+          <w:rFonts w:ascii="Courier New" w:cs="Courier New" w:eastAsia="Courier New" w:hAnsi="Courier New"/>
+          <w:b w:val="false"/>
+          <w:bCs w:val="false"/>
+          <w:color w:val="1F2937"/>
+          <w:sz w:val="18"/>
+          <w:szCs w:val="18"/>
+          <w:shd w:fill="F1F3F5" w:color="auto" w:val="clear"/>
+          <w:rtl/>
+        </w:rPr>
+        <w:t xml:space="preserve">‎plat.usp_RunTenantTransitions‎</w:t>
+      </w:r>
+      <w:r>
+        <w:rPr>
+          <w:rFonts w:ascii="Arial" w:cs="Arial" w:eastAsia="Arial" w:hAnsi="Arial"/>
+          <w:b w:val="false"/>
+          <w:bCs w:val="false"/>
+          <w:sz w:val="20"/>
+          <w:szCs w:val="20"/>
+          <w:rtl/>
+        </w:rPr>
+        <w:t xml:space="preserve">.</w:t>
       </w:r>
     </w:p>
     <w:p>
@@ -16931,14 +17039,23 @@
             </w:pPr>
             <w:r>
               <w:rPr>
-                <w:rFonts w:ascii="Arial" w:cs="Arial" w:eastAsia="Arial" w:hAnsi="Arial"/>
-                <w:b w:val="false"/>
-                <w:bCs w:val="false"/>
-                <w:sz w:val="18"/>
-                <w:szCs w:val="18"/>
-                <w:rtl/>
-              </w:rPr>
-              <w:t xml:space="preserve">الإنجليزية، ويُعدَّل FR-NTF-024</w:t>
+                <w:rFonts w:ascii="Segoe UI Emoji" w:cs="Segoe UI Emoji" w:eastAsia="Segoe UI Emoji" w:hAnsi="Segoe UI Emoji"/>
+                <w:sz w:val="18"/>
+                <w:szCs w:val="18"/>
+                <w:rtl/>
+              </w:rPr>
+              <w:t xml:space="preserve">✅</w:t>
+            </w:r>
+            <w:r>
+              <w:rPr>
+                <w:rFonts w:ascii="Arial" w:cs="Arial" w:eastAsia="Arial" w:hAnsi="Arial"/>
+                <w:b w:val="false"/>
+                <w:bCs w:val="false"/>
+                <w:sz w:val="18"/>
+                <w:szCs w:val="18"/>
+                <w:rtl/>
+              </w:rPr>
+              <w:t xml:space="preserve"> معتمد من المالك (2026-10-12): الإنجليزية، ويُعدَّل FR-NTF-024</w:t>
             </w:r>
           </w:p>
         </w:tc>
@@ -17694,14 +17811,23 @@
             </w:pPr>
             <w:r>
               <w:rPr>
-                <w:rFonts w:ascii="Arial" w:cs="Arial" w:eastAsia="Arial" w:hAnsi="Arial"/>
-                <w:b w:val="false"/>
-                <w:bCs w:val="false"/>
-                <w:sz w:val="18"/>
-                <w:szCs w:val="18"/>
-                <w:rtl/>
-              </w:rPr>
-              <w:t xml:space="preserve">تبقى PENDING حتى يعود نشطًا؛ وتنبيه TA بالتعليق بريد منصة لا إشعار مشترك</w:t>
+                <w:rFonts w:ascii="Segoe UI Emoji" w:cs="Segoe UI Emoji" w:eastAsia="Segoe UI Emoji" w:hAnsi="Segoe UI Emoji"/>
+                <w:sz w:val="18"/>
+                <w:szCs w:val="18"/>
+                <w:rtl/>
+              </w:rPr>
+              <w:t xml:space="preserve">✅</w:t>
+            </w:r>
+            <w:r>
+              <w:rPr>
+                <w:rFonts w:ascii="Arial" w:cs="Arial" w:eastAsia="Arial" w:hAnsi="Arial"/>
+                <w:b w:val="false"/>
+                <w:bCs w:val="false"/>
+                <w:sz w:val="18"/>
+                <w:szCs w:val="18"/>
+                <w:rtl/>
+              </w:rPr>
+              <w:t xml:space="preserve"> معتمد من المالك (2026-10-12): تبقى PENDING حتى يعود نشطًا؛ وتنبيه TA بالتعليق بريد منصة لا إشعار مشترك</w:t>
             </w:r>
           </w:p>
         </w:tc>

</xml_diff>

<commit_message>
Word files rebuilt for the owner's approval of the four implementation choices
The owner decisions, the review register, the external review package, the readiness documents and both volumes.

Co-Authored-By: Claude Opus 5.5 <noreply@anthropic.com>
Claude-Session: https://claude.ai/code/session_012HHcRrzuvMBTL2FYxXtsyv
</commit_message>
<xml_diff>
--- a/treasury-platform/docs/30-readiness/word/DOC-F17-async-events-outbox-jobs-notifications.docx
+++ b/treasury-platform/docs/30-readiness/word/DOC-F17-async-events-outbox-jobs-notifications.docx
@@ -10201,7 +10201,27 @@
                 <w:szCs w:val="18"/>
                 <w:rtl/>
               </w:rPr>
-              <w:t xml:space="preserve">JOB-PLT-RECONCILE (أُضيفت 2026-10-13، ADR 0011)</w:t>
+              <w:t xml:space="preserve">JOB-PLT-RECONCILE (أُضيفت 2026-10-13، ADR 0011؛ </w:t>
+            </w:r>
+            <w:r>
+              <w:rPr>
+                <w:rFonts w:ascii="Segoe UI Emoji" w:cs="Segoe UI Emoji" w:eastAsia="Segoe UI Emoji" w:hAnsi="Segoe UI Emoji"/>
+                <w:sz w:val="18"/>
+                <w:szCs w:val="18"/>
+                <w:rtl/>
+              </w:rPr>
+              <w:t xml:space="preserve">✅</w:t>
+            </w:r>
+            <w:r>
+              <w:rPr>
+                <w:rFonts w:ascii="Arial" w:cs="Arial" w:eastAsia="Arial" w:hAnsi="Arial"/>
+                <w:b w:val="false"/>
+                <w:bCs w:val="false"/>
+                <w:sz w:val="18"/>
+                <w:szCs w:val="18"/>
+                <w:rtl/>
+              </w:rPr>
+              <w:t xml:space="preserve"> اعتمدها المالك 2026-10-14)</w:t>
             </w:r>
           </w:p>
         </w:tc>

</xml_diff>

<commit_message>
Early warning job: notifications of lender dates not ready (ADR 0027)
JOB-FIN-READINESS runs fin.usp_RunEarlyWarnings daily, bound as the tenant's
service account. Each lender date in the lead time that is not ready warns once
per stage of the time left (lead time, 90, 30, 7 days) and readiness, again
only when AMBER worsens to RED; the log fin.EarlyWarningAlert and a
notification.requested outbox row are written in one transaction. Test CA23,
FR-FIN-040, BR-FIN-041, event FIN.READINESS_WARNING, docs and diagrams.

Co-Authored-By: Claude Opus 5.5 <noreply@anthropic.com>
Claude-Session: https://claude.ai/code/session_012HHcRrzuvMBTL2FYxXtsyv
</commit_message>
<xml_diff>
--- a/treasury-platform/docs/30-readiness/word/DOC-F17-async-events-outbox-jobs-notifications.docx
+++ b/treasury-platform/docs/30-readiness/word/DOC-F17-async-events-outbox-jobs-notifications.docx
@@ -5632,12 +5632,12 @@
         </w:tblBorders>
       </w:tblPr>
       <w:tblGrid>
-        <w:gridCol w:w="2078"/>
-        <w:gridCol w:w="973"/>
-        <w:gridCol w:w="973"/>
-        <w:gridCol w:w="2377"/>
-        <w:gridCol w:w="1484"/>
-        <w:gridCol w:w="1979"/>
+        <w:gridCol w:w="1960"/>
+        <w:gridCol w:w="965"/>
+        <w:gridCol w:w="965"/>
+        <w:gridCol w:w="2240"/>
+        <w:gridCol w:w="1400"/>
+        <w:gridCol w:w="2334"/>
       </w:tblGrid>
       <w:tr>
         <w:trPr>
@@ -5646,7 +5646,7 @@
         </w:trPr>
         <w:tc>
           <w:tcPr>
-            <w:tcW w:type="dxa" w:w="2078"/>
+            <w:tcW w:type="dxa" w:w="1960"/>
             <w:tcBorders>
               <w:top w:val="single" w:color="BFC9D6" w:sz="4"/>
               <w:left w:val="single" w:color="BFC9D6" w:sz="4"/>
@@ -5684,7 +5684,7 @@
         </w:tc>
         <w:tc>
           <w:tcPr>
-            <w:tcW w:type="dxa" w:w="973"/>
+            <w:tcW w:type="dxa" w:w="965"/>
             <w:tcBorders>
               <w:top w:val="single" w:color="BFC9D6" w:sz="4"/>
               <w:left w:val="single" w:color="BFC9D6" w:sz="4"/>
@@ -5722,7 +5722,7 @@
         </w:tc>
         <w:tc>
           <w:tcPr>
-            <w:tcW w:type="dxa" w:w="973"/>
+            <w:tcW w:type="dxa" w:w="965"/>
             <w:tcBorders>
               <w:top w:val="single" w:color="BFC9D6" w:sz="4"/>
               <w:left w:val="single" w:color="BFC9D6" w:sz="4"/>
@@ -5760,7 +5760,7 @@
         </w:tc>
         <w:tc>
           <w:tcPr>
-            <w:tcW w:type="dxa" w:w="2377"/>
+            <w:tcW w:type="dxa" w:w="2240"/>
             <w:tcBorders>
               <w:top w:val="single" w:color="BFC9D6" w:sz="4"/>
               <w:left w:val="single" w:color="BFC9D6" w:sz="4"/>
@@ -5798,7 +5798,7 @@
         </w:tc>
         <w:tc>
           <w:tcPr>
-            <w:tcW w:type="dxa" w:w="1484"/>
+            <w:tcW w:type="dxa" w:w="1400"/>
             <w:tcBorders>
               <w:top w:val="single" w:color="BFC9D6" w:sz="4"/>
               <w:left w:val="single" w:color="BFC9D6" w:sz="4"/>
@@ -5836,7 +5836,7 @@
         </w:tc>
         <w:tc>
           <w:tcPr>
-            <w:tcW w:type="dxa" w:w="1979"/>
+            <w:tcW w:type="dxa" w:w="2334"/>
             <w:tcBorders>
               <w:top w:val="single" w:color="BFC9D6" w:sz="4"/>
               <w:left w:val="single" w:color="BFC9D6" w:sz="4"/>
@@ -5879,7 +5879,7 @@
         </w:trPr>
         <w:tc>
           <w:tcPr>
-            <w:tcW w:type="dxa" w:w="2078"/>
+            <w:tcW w:type="dxa" w:w="1960"/>
             <w:tcBorders>
               <w:top w:val="single" w:color="BFC9D6" w:sz="4"/>
               <w:left w:val="single" w:color="BFC9D6" w:sz="4"/>
@@ -5925,7 +5925,7 @@
         </w:tc>
         <w:tc>
           <w:tcPr>
-            <w:tcW w:type="dxa" w:w="973"/>
+            <w:tcW w:type="dxa" w:w="965"/>
             <w:tcBorders>
               <w:top w:val="single" w:color="BFC9D6" w:sz="4"/>
               <w:left w:val="single" w:color="BFC9D6" w:sz="4"/>
@@ -5961,7 +5961,7 @@
         </w:tc>
         <w:tc>
           <w:tcPr>
-            <w:tcW w:type="dxa" w:w="973"/>
+            <w:tcW w:type="dxa" w:w="965"/>
             <w:tcBorders>
               <w:top w:val="single" w:color="BFC9D6" w:sz="4"/>
               <w:left w:val="single" w:color="BFC9D6" w:sz="4"/>
@@ -5997,7 +5997,7 @@
         </w:tc>
         <w:tc>
           <w:tcPr>
-            <w:tcW w:type="dxa" w:w="2377"/>
+            <w:tcW w:type="dxa" w:w="2240"/>
             <w:tcBorders>
               <w:top w:val="single" w:color="BFC9D6" w:sz="4"/>
               <w:left w:val="single" w:color="BFC9D6" w:sz="4"/>
@@ -6033,7 +6033,7 @@
         </w:tc>
         <w:tc>
           <w:tcPr>
-            <w:tcW w:type="dxa" w:w="1484"/>
+            <w:tcW w:type="dxa" w:w="1400"/>
             <w:tcBorders>
               <w:top w:val="single" w:color="BFC9D6" w:sz="4"/>
               <w:left w:val="single" w:color="BFC9D6" w:sz="4"/>
@@ -6069,7 +6069,7 @@
         </w:tc>
         <w:tc>
           <w:tcPr>
-            <w:tcW w:type="dxa" w:w="1979"/>
+            <w:tcW w:type="dxa" w:w="2334"/>
             <w:tcBorders>
               <w:top w:val="single" w:color="BFC9D6" w:sz="4"/>
               <w:left w:val="single" w:color="BFC9D6" w:sz="4"/>
@@ -6110,7 +6110,7 @@
         </w:trPr>
         <w:tc>
           <w:tcPr>
-            <w:tcW w:type="dxa" w:w="2078"/>
+            <w:tcW w:type="dxa" w:w="1960"/>
             <w:tcBorders>
               <w:top w:val="single" w:color="BFC9D6" w:sz="4"/>
               <w:left w:val="single" w:color="BFC9D6" w:sz="4"/>
@@ -6147,7 +6147,7 @@
         </w:tc>
         <w:tc>
           <w:tcPr>
-            <w:tcW w:type="dxa" w:w="973"/>
+            <w:tcW w:type="dxa" w:w="965"/>
             <w:tcBorders>
               <w:top w:val="single" w:color="BFC9D6" w:sz="4"/>
               <w:left w:val="single" w:color="BFC9D6" w:sz="4"/>
@@ -6184,7 +6184,7 @@
         </w:tc>
         <w:tc>
           <w:tcPr>
-            <w:tcW w:type="dxa" w:w="973"/>
+            <w:tcW w:type="dxa" w:w="965"/>
             <w:tcBorders>
               <w:top w:val="single" w:color="BFC9D6" w:sz="4"/>
               <w:left w:val="single" w:color="BFC9D6" w:sz="4"/>
@@ -6221,7 +6221,7 @@
         </w:tc>
         <w:tc>
           <w:tcPr>
-            <w:tcW w:type="dxa" w:w="2377"/>
+            <w:tcW w:type="dxa" w:w="2240"/>
             <w:tcBorders>
               <w:top w:val="single" w:color="BFC9D6" w:sz="4"/>
               <w:left w:val="single" w:color="BFC9D6" w:sz="4"/>
@@ -6258,7 +6258,7 @@
         </w:tc>
         <w:tc>
           <w:tcPr>
-            <w:tcW w:type="dxa" w:w="1484"/>
+            <w:tcW w:type="dxa" w:w="1400"/>
             <w:tcBorders>
               <w:top w:val="single" w:color="BFC9D6" w:sz="4"/>
               <w:left w:val="single" w:color="BFC9D6" w:sz="4"/>
@@ -6295,7 +6295,7 @@
         </w:tc>
         <w:tc>
           <w:tcPr>
-            <w:tcW w:type="dxa" w:w="1979"/>
+            <w:tcW w:type="dxa" w:w="2334"/>
             <w:tcBorders>
               <w:top w:val="single" w:color="BFC9D6" w:sz="4"/>
               <w:left w:val="single" w:color="BFC9D6" w:sz="4"/>
@@ -6337,7 +6337,7 @@
         </w:trPr>
         <w:tc>
           <w:tcPr>
-            <w:tcW w:type="dxa" w:w="2078"/>
+            <w:tcW w:type="dxa" w:w="1960"/>
             <w:tcBorders>
               <w:top w:val="single" w:color="BFC9D6" w:sz="4"/>
               <w:left w:val="single" w:color="BFC9D6" w:sz="4"/>
@@ -6373,7 +6373,7 @@
         </w:tc>
         <w:tc>
           <w:tcPr>
-            <w:tcW w:type="dxa" w:w="973"/>
+            <w:tcW w:type="dxa" w:w="965"/>
             <w:tcBorders>
               <w:top w:val="single" w:color="BFC9D6" w:sz="4"/>
               <w:left w:val="single" w:color="BFC9D6" w:sz="4"/>
@@ -6409,7 +6409,7 @@
         </w:tc>
         <w:tc>
           <w:tcPr>
-            <w:tcW w:type="dxa" w:w="973"/>
+            <w:tcW w:type="dxa" w:w="965"/>
             <w:tcBorders>
               <w:top w:val="single" w:color="BFC9D6" w:sz="4"/>
               <w:left w:val="single" w:color="BFC9D6" w:sz="4"/>
@@ -6445,7 +6445,7 @@
         </w:tc>
         <w:tc>
           <w:tcPr>
-            <w:tcW w:type="dxa" w:w="2377"/>
+            <w:tcW w:type="dxa" w:w="2240"/>
             <w:tcBorders>
               <w:top w:val="single" w:color="BFC9D6" w:sz="4"/>
               <w:left w:val="single" w:color="BFC9D6" w:sz="4"/>
@@ -6481,7 +6481,7 @@
         </w:tc>
         <w:tc>
           <w:tcPr>
-            <w:tcW w:type="dxa" w:w="1484"/>
+            <w:tcW w:type="dxa" w:w="1400"/>
             <w:tcBorders>
               <w:top w:val="single" w:color="BFC9D6" w:sz="4"/>
               <w:left w:val="single" w:color="BFC9D6" w:sz="4"/>
@@ -6517,7 +6517,7 @@
         </w:tc>
         <w:tc>
           <w:tcPr>
-            <w:tcW w:type="dxa" w:w="1979"/>
+            <w:tcW w:type="dxa" w:w="2334"/>
             <w:tcBorders>
               <w:top w:val="single" w:color="BFC9D6" w:sz="4"/>
               <w:left w:val="single" w:color="BFC9D6" w:sz="4"/>
@@ -6558,7 +6558,7 @@
         </w:trPr>
         <w:tc>
           <w:tcPr>
-            <w:tcW w:type="dxa" w:w="2078"/>
+            <w:tcW w:type="dxa" w:w="1960"/>
             <w:tcBorders>
               <w:top w:val="single" w:color="BFC9D6" w:sz="4"/>
               <w:left w:val="single" w:color="BFC9D6" w:sz="4"/>
@@ -6595,7 +6595,7 @@
         </w:tc>
         <w:tc>
           <w:tcPr>
-            <w:tcW w:type="dxa" w:w="973"/>
+            <w:tcW w:type="dxa" w:w="965"/>
             <w:tcBorders>
               <w:top w:val="single" w:color="BFC9D6" w:sz="4"/>
               <w:left w:val="single" w:color="BFC9D6" w:sz="4"/>
@@ -6632,7 +6632,7 @@
         </w:tc>
         <w:tc>
           <w:tcPr>
-            <w:tcW w:type="dxa" w:w="973"/>
+            <w:tcW w:type="dxa" w:w="965"/>
             <w:tcBorders>
               <w:top w:val="single" w:color="BFC9D6" w:sz="4"/>
               <w:left w:val="single" w:color="BFC9D6" w:sz="4"/>
@@ -6669,7 +6669,7 @@
         </w:tc>
         <w:tc>
           <w:tcPr>
-            <w:tcW w:type="dxa" w:w="2377"/>
+            <w:tcW w:type="dxa" w:w="2240"/>
             <w:tcBorders>
               <w:top w:val="single" w:color="BFC9D6" w:sz="4"/>
               <w:left w:val="single" w:color="BFC9D6" w:sz="4"/>
@@ -6706,7 +6706,7 @@
         </w:tc>
         <w:tc>
           <w:tcPr>
-            <w:tcW w:type="dxa" w:w="1484"/>
+            <w:tcW w:type="dxa" w:w="1400"/>
             <w:tcBorders>
               <w:top w:val="single" w:color="BFC9D6" w:sz="4"/>
               <w:left w:val="single" w:color="BFC9D6" w:sz="4"/>
@@ -6743,7 +6743,7 @@
         </w:tc>
         <w:tc>
           <w:tcPr>
-            <w:tcW w:type="dxa" w:w="1979"/>
+            <w:tcW w:type="dxa" w:w="2334"/>
             <w:tcBorders>
               <w:top w:val="single" w:color="BFC9D6" w:sz="4"/>
               <w:left w:val="single" w:color="BFC9D6" w:sz="4"/>
@@ -6785,7 +6785,7 @@
         </w:trPr>
         <w:tc>
           <w:tcPr>
-            <w:tcW w:type="dxa" w:w="2078"/>
+            <w:tcW w:type="dxa" w:w="1960"/>
             <w:tcBorders>
               <w:top w:val="single" w:color="BFC9D6" w:sz="4"/>
               <w:left w:val="single" w:color="BFC9D6" w:sz="4"/>
@@ -6821,7 +6821,7 @@
         </w:tc>
         <w:tc>
           <w:tcPr>
-            <w:tcW w:type="dxa" w:w="973"/>
+            <w:tcW w:type="dxa" w:w="965"/>
             <w:tcBorders>
               <w:top w:val="single" w:color="BFC9D6" w:sz="4"/>
               <w:left w:val="single" w:color="BFC9D6" w:sz="4"/>
@@ -6857,7 +6857,7 @@
         </w:tc>
         <w:tc>
           <w:tcPr>
-            <w:tcW w:type="dxa" w:w="973"/>
+            <w:tcW w:type="dxa" w:w="965"/>
             <w:tcBorders>
               <w:top w:val="single" w:color="BFC9D6" w:sz="4"/>
               <w:left w:val="single" w:color="BFC9D6" w:sz="4"/>
@@ -6893,7 +6893,7 @@
         </w:tc>
         <w:tc>
           <w:tcPr>
-            <w:tcW w:type="dxa" w:w="2377"/>
+            <w:tcW w:type="dxa" w:w="2240"/>
             <w:tcBorders>
               <w:top w:val="single" w:color="BFC9D6" w:sz="4"/>
               <w:left w:val="single" w:color="BFC9D6" w:sz="4"/>
@@ -6929,7 +6929,7 @@
         </w:tc>
         <w:tc>
           <w:tcPr>
-            <w:tcW w:type="dxa" w:w="1484"/>
+            <w:tcW w:type="dxa" w:w="1400"/>
             <w:tcBorders>
               <w:top w:val="single" w:color="BFC9D6" w:sz="4"/>
               <w:left w:val="single" w:color="BFC9D6" w:sz="4"/>
@@ -6965,7 +6965,7 @@
         </w:tc>
         <w:tc>
           <w:tcPr>
-            <w:tcW w:type="dxa" w:w="1979"/>
+            <w:tcW w:type="dxa" w:w="2334"/>
             <w:tcBorders>
               <w:top w:val="single" w:color="BFC9D6" w:sz="4"/>
               <w:left w:val="single" w:color="BFC9D6" w:sz="4"/>
@@ -7006,7 +7006,7 @@
         </w:trPr>
         <w:tc>
           <w:tcPr>
-            <w:tcW w:type="dxa" w:w="2078"/>
+            <w:tcW w:type="dxa" w:w="1960"/>
             <w:tcBorders>
               <w:top w:val="single" w:color="BFC9D6" w:sz="4"/>
               <w:left w:val="single" w:color="BFC9D6" w:sz="4"/>
@@ -7043,7 +7043,7 @@
         </w:tc>
         <w:tc>
           <w:tcPr>
-            <w:tcW w:type="dxa" w:w="973"/>
+            <w:tcW w:type="dxa" w:w="965"/>
             <w:tcBorders>
               <w:top w:val="single" w:color="BFC9D6" w:sz="4"/>
               <w:left w:val="single" w:color="BFC9D6" w:sz="4"/>
@@ -7080,7 +7080,7 @@
         </w:tc>
         <w:tc>
           <w:tcPr>
-            <w:tcW w:type="dxa" w:w="973"/>
+            <w:tcW w:type="dxa" w:w="965"/>
             <w:tcBorders>
               <w:top w:val="single" w:color="BFC9D6" w:sz="4"/>
               <w:left w:val="single" w:color="BFC9D6" w:sz="4"/>
@@ -7117,7 +7117,7 @@
         </w:tc>
         <w:tc>
           <w:tcPr>
-            <w:tcW w:type="dxa" w:w="2377"/>
+            <w:tcW w:type="dxa" w:w="2240"/>
             <w:tcBorders>
               <w:top w:val="single" w:color="BFC9D6" w:sz="4"/>
               <w:left w:val="single" w:color="BFC9D6" w:sz="4"/>
@@ -7154,7 +7154,7 @@
         </w:tc>
         <w:tc>
           <w:tcPr>
-            <w:tcW w:type="dxa" w:w="1484"/>
+            <w:tcW w:type="dxa" w:w="1400"/>
             <w:tcBorders>
               <w:top w:val="single" w:color="BFC9D6" w:sz="4"/>
               <w:left w:val="single" w:color="BFC9D6" w:sz="4"/>
@@ -7191,7 +7191,7 @@
         </w:tc>
         <w:tc>
           <w:tcPr>
-            <w:tcW w:type="dxa" w:w="1979"/>
+            <w:tcW w:type="dxa" w:w="2334"/>
             <w:tcBorders>
               <w:top w:val="single" w:color="BFC9D6" w:sz="4"/>
               <w:left w:val="single" w:color="BFC9D6" w:sz="4"/>
@@ -7233,7 +7233,7 @@
         </w:trPr>
         <w:tc>
           <w:tcPr>
-            <w:tcW w:type="dxa" w:w="2078"/>
+            <w:tcW w:type="dxa" w:w="1960"/>
             <w:tcBorders>
               <w:top w:val="single" w:color="BFC9D6" w:sz="4"/>
               <w:left w:val="single" w:color="BFC9D6" w:sz="4"/>
@@ -7269,7 +7269,7 @@
         </w:tc>
         <w:tc>
           <w:tcPr>
-            <w:tcW w:type="dxa" w:w="973"/>
+            <w:tcW w:type="dxa" w:w="965"/>
             <w:tcBorders>
               <w:top w:val="single" w:color="BFC9D6" w:sz="4"/>
               <w:left w:val="single" w:color="BFC9D6" w:sz="4"/>
@@ -7305,7 +7305,7 @@
         </w:tc>
         <w:tc>
           <w:tcPr>
-            <w:tcW w:type="dxa" w:w="973"/>
+            <w:tcW w:type="dxa" w:w="965"/>
             <w:tcBorders>
               <w:top w:val="single" w:color="BFC9D6" w:sz="4"/>
               <w:left w:val="single" w:color="BFC9D6" w:sz="4"/>
@@ -7341,7 +7341,7 @@
         </w:tc>
         <w:tc>
           <w:tcPr>
-            <w:tcW w:type="dxa" w:w="2377"/>
+            <w:tcW w:type="dxa" w:w="2240"/>
             <w:tcBorders>
               <w:top w:val="single" w:color="BFC9D6" w:sz="4"/>
               <w:left w:val="single" w:color="BFC9D6" w:sz="4"/>
@@ -7377,7 +7377,7 @@
         </w:tc>
         <w:tc>
           <w:tcPr>
-            <w:tcW w:type="dxa" w:w="1484"/>
+            <w:tcW w:type="dxa" w:w="1400"/>
             <w:tcBorders>
               <w:top w:val="single" w:color="BFC9D6" w:sz="4"/>
               <w:left w:val="single" w:color="BFC9D6" w:sz="4"/>
@@ -7413,7 +7413,7 @@
         </w:tc>
         <w:tc>
           <w:tcPr>
-            <w:tcW w:type="dxa" w:w="1979"/>
+            <w:tcW w:type="dxa" w:w="2334"/>
             <w:tcBorders>
               <w:top w:val="single" w:color="BFC9D6" w:sz="4"/>
               <w:left w:val="single" w:color="BFC9D6" w:sz="4"/>
@@ -7454,7 +7454,7 @@
         </w:trPr>
         <w:tc>
           <w:tcPr>
-            <w:tcW w:type="dxa" w:w="2078"/>
+            <w:tcW w:type="dxa" w:w="1960"/>
             <w:tcBorders>
               <w:top w:val="single" w:color="BFC9D6" w:sz="4"/>
               <w:left w:val="single" w:color="BFC9D6" w:sz="4"/>
@@ -7491,7 +7491,7 @@
         </w:tc>
         <w:tc>
           <w:tcPr>
-            <w:tcW w:type="dxa" w:w="973"/>
+            <w:tcW w:type="dxa" w:w="965"/>
             <w:tcBorders>
               <w:top w:val="single" w:color="BFC9D6" w:sz="4"/>
               <w:left w:val="single" w:color="BFC9D6" w:sz="4"/>
@@ -7528,7 +7528,7 @@
         </w:tc>
         <w:tc>
           <w:tcPr>
-            <w:tcW w:type="dxa" w:w="973"/>
+            <w:tcW w:type="dxa" w:w="965"/>
             <w:tcBorders>
               <w:top w:val="single" w:color="BFC9D6" w:sz="4"/>
               <w:left w:val="single" w:color="BFC9D6" w:sz="4"/>
@@ -7565,7 +7565,7 @@
         </w:tc>
         <w:tc>
           <w:tcPr>
-            <w:tcW w:type="dxa" w:w="2377"/>
+            <w:tcW w:type="dxa" w:w="2240"/>
             <w:tcBorders>
               <w:top w:val="single" w:color="BFC9D6" w:sz="4"/>
               <w:left w:val="single" w:color="BFC9D6" w:sz="4"/>
@@ -7602,7 +7602,7 @@
         </w:tc>
         <w:tc>
           <w:tcPr>
-            <w:tcW w:type="dxa" w:w="1484"/>
+            <w:tcW w:type="dxa" w:w="1400"/>
             <w:tcBorders>
               <w:top w:val="single" w:color="BFC9D6" w:sz="4"/>
               <w:left w:val="single" w:color="BFC9D6" w:sz="4"/>
@@ -7639,7 +7639,7 @@
         </w:tc>
         <w:tc>
           <w:tcPr>
-            <w:tcW w:type="dxa" w:w="1979"/>
+            <w:tcW w:type="dxa" w:w="2334"/>
             <w:tcBorders>
               <w:top w:val="single" w:color="BFC9D6" w:sz="4"/>
               <w:left w:val="single" w:color="BFC9D6" w:sz="4"/>
@@ -7681,7 +7681,7 @@
         </w:trPr>
         <w:tc>
           <w:tcPr>
-            <w:tcW w:type="dxa" w:w="2078"/>
+            <w:tcW w:type="dxa" w:w="1960"/>
             <w:tcBorders>
               <w:top w:val="single" w:color="BFC9D6" w:sz="4"/>
               <w:left w:val="single" w:color="BFC9D6" w:sz="4"/>
@@ -7717,7 +7717,7 @@
         </w:tc>
         <w:tc>
           <w:tcPr>
-            <w:tcW w:type="dxa" w:w="973"/>
+            <w:tcW w:type="dxa" w:w="965"/>
             <w:tcBorders>
               <w:top w:val="single" w:color="BFC9D6" w:sz="4"/>
               <w:left w:val="single" w:color="BFC9D6" w:sz="4"/>
@@ -7753,7 +7753,7 @@
         </w:tc>
         <w:tc>
           <w:tcPr>
-            <w:tcW w:type="dxa" w:w="973"/>
+            <w:tcW w:type="dxa" w:w="965"/>
             <w:tcBorders>
               <w:top w:val="single" w:color="BFC9D6" w:sz="4"/>
               <w:left w:val="single" w:color="BFC9D6" w:sz="4"/>
@@ -7789,7 +7789,7 @@
         </w:tc>
         <w:tc>
           <w:tcPr>
-            <w:tcW w:type="dxa" w:w="2377"/>
+            <w:tcW w:type="dxa" w:w="2240"/>
             <w:tcBorders>
               <w:top w:val="single" w:color="BFC9D6" w:sz="4"/>
               <w:left w:val="single" w:color="BFC9D6" w:sz="4"/>
@@ -7825,7 +7825,7 @@
         </w:tc>
         <w:tc>
           <w:tcPr>
-            <w:tcW w:type="dxa" w:w="1484"/>
+            <w:tcW w:type="dxa" w:w="1400"/>
             <w:tcBorders>
               <w:top w:val="single" w:color="BFC9D6" w:sz="4"/>
               <w:left w:val="single" w:color="BFC9D6" w:sz="4"/>
@@ -7861,7 +7861,7 @@
         </w:tc>
         <w:tc>
           <w:tcPr>
-            <w:tcW w:type="dxa" w:w="1979"/>
+            <w:tcW w:type="dxa" w:w="2334"/>
             <w:tcBorders>
               <w:top w:val="single" w:color="BFC9D6" w:sz="4"/>
               <w:left w:val="single" w:color="BFC9D6" w:sz="4"/>
@@ -7902,7 +7902,7 @@
         </w:trPr>
         <w:tc>
           <w:tcPr>
-            <w:tcW w:type="dxa" w:w="2078"/>
+            <w:tcW w:type="dxa" w:w="1960"/>
             <w:tcBorders>
               <w:top w:val="single" w:color="BFC9D6" w:sz="4"/>
               <w:left w:val="single" w:color="BFC9D6" w:sz="4"/>
@@ -7939,7 +7939,7 @@
         </w:tc>
         <w:tc>
           <w:tcPr>
-            <w:tcW w:type="dxa" w:w="973"/>
+            <w:tcW w:type="dxa" w:w="965"/>
             <w:tcBorders>
               <w:top w:val="single" w:color="BFC9D6" w:sz="4"/>
               <w:left w:val="single" w:color="BFC9D6" w:sz="4"/>
@@ -7976,7 +7976,7 @@
         </w:tc>
         <w:tc>
           <w:tcPr>
-            <w:tcW w:type="dxa" w:w="973"/>
+            <w:tcW w:type="dxa" w:w="965"/>
             <w:tcBorders>
               <w:top w:val="single" w:color="BFC9D6" w:sz="4"/>
               <w:left w:val="single" w:color="BFC9D6" w:sz="4"/>
@@ -8013,7 +8013,7 @@
         </w:tc>
         <w:tc>
           <w:tcPr>
-            <w:tcW w:type="dxa" w:w="2377"/>
+            <w:tcW w:type="dxa" w:w="2240"/>
             <w:tcBorders>
               <w:top w:val="single" w:color="BFC9D6" w:sz="4"/>
               <w:left w:val="single" w:color="BFC9D6" w:sz="4"/>
@@ -8050,7 +8050,7 @@
         </w:tc>
         <w:tc>
           <w:tcPr>
-            <w:tcW w:type="dxa" w:w="1484"/>
+            <w:tcW w:type="dxa" w:w="1400"/>
             <w:tcBorders>
               <w:top w:val="single" w:color="BFC9D6" w:sz="4"/>
               <w:left w:val="single" w:color="BFC9D6" w:sz="4"/>
@@ -8087,7 +8087,7 @@
         </w:tc>
         <w:tc>
           <w:tcPr>
-            <w:tcW w:type="dxa" w:w="1979"/>
+            <w:tcW w:type="dxa" w:w="2334"/>
             <w:tcBorders>
               <w:top w:val="single" w:color="BFC9D6" w:sz="4"/>
               <w:left w:val="single" w:color="BFC9D6" w:sz="4"/>
@@ -8129,7 +8129,7 @@
         </w:trPr>
         <w:tc>
           <w:tcPr>
-            <w:tcW w:type="dxa" w:w="2078"/>
+            <w:tcW w:type="dxa" w:w="1960"/>
             <w:tcBorders>
               <w:top w:val="single" w:color="BFC9D6" w:sz="4"/>
               <w:left w:val="single" w:color="BFC9D6" w:sz="4"/>
@@ -8165,7 +8165,7 @@
         </w:tc>
         <w:tc>
           <w:tcPr>
-            <w:tcW w:type="dxa" w:w="973"/>
+            <w:tcW w:type="dxa" w:w="965"/>
             <w:tcBorders>
               <w:top w:val="single" w:color="BFC9D6" w:sz="4"/>
               <w:left w:val="single" w:color="BFC9D6" w:sz="4"/>
@@ -8201,7 +8201,7 @@
         </w:tc>
         <w:tc>
           <w:tcPr>
-            <w:tcW w:type="dxa" w:w="973"/>
+            <w:tcW w:type="dxa" w:w="965"/>
             <w:tcBorders>
               <w:top w:val="single" w:color="BFC9D6" w:sz="4"/>
               <w:left w:val="single" w:color="BFC9D6" w:sz="4"/>
@@ -8258,7 +8258,7 @@
         </w:tc>
         <w:tc>
           <w:tcPr>
-            <w:tcW w:type="dxa" w:w="2377"/>
+            <w:tcW w:type="dxa" w:w="2240"/>
             <w:tcBorders>
               <w:top w:val="single" w:color="BFC9D6" w:sz="4"/>
               <w:left w:val="single" w:color="BFC9D6" w:sz="4"/>
@@ -8294,7 +8294,7 @@
         </w:tc>
         <w:tc>
           <w:tcPr>
-            <w:tcW w:type="dxa" w:w="1484"/>
+            <w:tcW w:type="dxa" w:w="1400"/>
             <w:tcBorders>
               <w:top w:val="single" w:color="BFC9D6" w:sz="4"/>
               <w:left w:val="single" w:color="BFC9D6" w:sz="4"/>
@@ -8330,7 +8330,7 @@
         </w:tc>
         <w:tc>
           <w:tcPr>
-            <w:tcW w:type="dxa" w:w="1979"/>
+            <w:tcW w:type="dxa" w:w="2334"/>
             <w:tcBorders>
               <w:top w:val="single" w:color="BFC9D6" w:sz="4"/>
               <w:left w:val="single" w:color="BFC9D6" w:sz="4"/>
@@ -8371,7 +8371,7 @@
         </w:trPr>
         <w:tc>
           <w:tcPr>
-            <w:tcW w:type="dxa" w:w="2078"/>
+            <w:tcW w:type="dxa" w:w="1960"/>
             <w:tcBorders>
               <w:top w:val="single" w:color="BFC9D6" w:sz="4"/>
               <w:left w:val="single" w:color="BFC9D6" w:sz="4"/>
@@ -8408,7 +8408,7 @@
         </w:tc>
         <w:tc>
           <w:tcPr>
-            <w:tcW w:type="dxa" w:w="973"/>
+            <w:tcW w:type="dxa" w:w="965"/>
             <w:tcBorders>
               <w:top w:val="single" w:color="BFC9D6" w:sz="4"/>
               <w:left w:val="single" w:color="BFC9D6" w:sz="4"/>
@@ -8445,7 +8445,7 @@
         </w:tc>
         <w:tc>
           <w:tcPr>
-            <w:tcW w:type="dxa" w:w="973"/>
+            <w:tcW w:type="dxa" w:w="965"/>
             <w:tcBorders>
               <w:top w:val="single" w:color="BFC9D6" w:sz="4"/>
               <w:left w:val="single" w:color="BFC9D6" w:sz="4"/>
@@ -8503,7 +8503,7 @@
         </w:tc>
         <w:tc>
           <w:tcPr>
-            <w:tcW w:type="dxa" w:w="2377"/>
+            <w:tcW w:type="dxa" w:w="2240"/>
             <w:tcBorders>
               <w:top w:val="single" w:color="BFC9D6" w:sz="4"/>
               <w:left w:val="single" w:color="BFC9D6" w:sz="4"/>
@@ -8540,7 +8540,7 @@
         </w:tc>
         <w:tc>
           <w:tcPr>
-            <w:tcW w:type="dxa" w:w="1484"/>
+            <w:tcW w:type="dxa" w:w="1400"/>
             <w:tcBorders>
               <w:top w:val="single" w:color="BFC9D6" w:sz="4"/>
               <w:left w:val="single" w:color="BFC9D6" w:sz="4"/>
@@ -8577,7 +8577,7 @@
         </w:tc>
         <w:tc>
           <w:tcPr>
-            <w:tcW w:type="dxa" w:w="1979"/>
+            <w:tcW w:type="dxa" w:w="2334"/>
             <w:tcBorders>
               <w:top w:val="single" w:color="BFC9D6" w:sz="4"/>
               <w:left w:val="single" w:color="BFC9D6" w:sz="4"/>
@@ -8619,7 +8619,7 @@
         </w:trPr>
         <w:tc>
           <w:tcPr>
-            <w:tcW w:type="dxa" w:w="2078"/>
+            <w:tcW w:type="dxa" w:w="1960"/>
             <w:tcBorders>
               <w:top w:val="single" w:color="BFC9D6" w:sz="4"/>
               <w:left w:val="single" w:color="BFC9D6" w:sz="4"/>
@@ -8655,7 +8655,7 @@
         </w:tc>
         <w:tc>
           <w:tcPr>
-            <w:tcW w:type="dxa" w:w="973"/>
+            <w:tcW w:type="dxa" w:w="965"/>
             <w:tcBorders>
               <w:top w:val="single" w:color="BFC9D6" w:sz="4"/>
               <w:left w:val="single" w:color="BFC9D6" w:sz="4"/>
@@ -8691,7 +8691,7 @@
         </w:tc>
         <w:tc>
           <w:tcPr>
-            <w:tcW w:type="dxa" w:w="973"/>
+            <w:tcW w:type="dxa" w:w="965"/>
             <w:tcBorders>
               <w:top w:val="single" w:color="BFC9D6" w:sz="4"/>
               <w:left w:val="single" w:color="BFC9D6" w:sz="4"/>
@@ -8727,7 +8727,7 @@
         </w:tc>
         <w:tc>
           <w:tcPr>
-            <w:tcW w:type="dxa" w:w="2377"/>
+            <w:tcW w:type="dxa" w:w="2240"/>
             <w:tcBorders>
               <w:top w:val="single" w:color="BFC9D6" w:sz="4"/>
               <w:left w:val="single" w:color="BFC9D6" w:sz="4"/>
@@ -8763,7 +8763,7 @@
         </w:tc>
         <w:tc>
           <w:tcPr>
-            <w:tcW w:type="dxa" w:w="1484"/>
+            <w:tcW w:type="dxa" w:w="1400"/>
             <w:tcBorders>
               <w:top w:val="single" w:color="BFC9D6" w:sz="4"/>
               <w:left w:val="single" w:color="BFC9D6" w:sz="4"/>
@@ -8799,7 +8799,7 @@
         </w:tc>
         <w:tc>
           <w:tcPr>
-            <w:tcW w:type="dxa" w:w="1979"/>
+            <w:tcW w:type="dxa" w:w="2334"/>
             <w:tcBorders>
               <w:top w:val="single" w:color="BFC9D6" w:sz="4"/>
               <w:left w:val="single" w:color="BFC9D6" w:sz="4"/>
@@ -8840,7 +8840,7 @@
         </w:trPr>
         <w:tc>
           <w:tcPr>
-            <w:tcW w:type="dxa" w:w="2078"/>
+            <w:tcW w:type="dxa" w:w="1960"/>
             <w:tcBorders>
               <w:top w:val="single" w:color="BFC9D6" w:sz="4"/>
               <w:left w:val="single" w:color="BFC9D6" w:sz="4"/>
@@ -8877,7 +8877,7 @@
         </w:tc>
         <w:tc>
           <w:tcPr>
-            <w:tcW w:type="dxa" w:w="973"/>
+            <w:tcW w:type="dxa" w:w="965"/>
             <w:tcBorders>
               <w:top w:val="single" w:color="BFC9D6" w:sz="4"/>
               <w:left w:val="single" w:color="BFC9D6" w:sz="4"/>
@@ -8914,7 +8914,7 @@
         </w:tc>
         <w:tc>
           <w:tcPr>
-            <w:tcW w:type="dxa" w:w="973"/>
+            <w:tcW w:type="dxa" w:w="965"/>
             <w:tcBorders>
               <w:top w:val="single" w:color="BFC9D6" w:sz="4"/>
               <w:left w:val="single" w:color="BFC9D6" w:sz="4"/>
@@ -8951,7 +8951,7 @@
         </w:tc>
         <w:tc>
           <w:tcPr>
-            <w:tcW w:type="dxa" w:w="2377"/>
+            <w:tcW w:type="dxa" w:w="2240"/>
             <w:tcBorders>
               <w:top w:val="single" w:color="BFC9D6" w:sz="4"/>
               <w:left w:val="single" w:color="BFC9D6" w:sz="4"/>
@@ -8988,7 +8988,7 @@
         </w:tc>
         <w:tc>
           <w:tcPr>
-            <w:tcW w:type="dxa" w:w="1484"/>
+            <w:tcW w:type="dxa" w:w="1400"/>
             <w:tcBorders>
               <w:top w:val="single" w:color="BFC9D6" w:sz="4"/>
               <w:left w:val="single" w:color="BFC9D6" w:sz="4"/>
@@ -9025,7 +9025,7 @@
         </w:tc>
         <w:tc>
           <w:tcPr>
-            <w:tcW w:type="dxa" w:w="1979"/>
+            <w:tcW w:type="dxa" w:w="2334"/>
             <w:tcBorders>
               <w:top w:val="single" w:color="BFC9D6" w:sz="4"/>
               <w:left w:val="single" w:color="BFC9D6" w:sz="4"/>
@@ -9067,7 +9067,7 @@
         </w:trPr>
         <w:tc>
           <w:tcPr>
-            <w:tcW w:type="dxa" w:w="2078"/>
+            <w:tcW w:type="dxa" w:w="1960"/>
             <w:tcBorders>
               <w:top w:val="single" w:color="BFC9D6" w:sz="4"/>
               <w:left w:val="single" w:color="BFC9D6" w:sz="4"/>
@@ -9103,7 +9103,7 @@
         </w:tc>
         <w:tc>
           <w:tcPr>
-            <w:tcW w:type="dxa" w:w="973"/>
+            <w:tcW w:type="dxa" w:w="965"/>
             <w:tcBorders>
               <w:top w:val="single" w:color="BFC9D6" w:sz="4"/>
               <w:left w:val="single" w:color="BFC9D6" w:sz="4"/>
@@ -9139,7 +9139,7 @@
         </w:tc>
         <w:tc>
           <w:tcPr>
-            <w:tcW w:type="dxa" w:w="973"/>
+            <w:tcW w:type="dxa" w:w="965"/>
             <w:tcBorders>
               <w:top w:val="single" w:color="BFC9D6" w:sz="4"/>
               <w:left w:val="single" w:color="BFC9D6" w:sz="4"/>
@@ -9175,7 +9175,7 @@
         </w:tc>
         <w:tc>
           <w:tcPr>
-            <w:tcW w:type="dxa" w:w="2377"/>
+            <w:tcW w:type="dxa" w:w="2240"/>
             <w:tcBorders>
               <w:top w:val="single" w:color="BFC9D6" w:sz="4"/>
               <w:left w:val="single" w:color="BFC9D6" w:sz="4"/>
@@ -9211,7 +9211,7 @@
         </w:tc>
         <w:tc>
           <w:tcPr>
-            <w:tcW w:type="dxa" w:w="1484"/>
+            <w:tcW w:type="dxa" w:w="1400"/>
             <w:tcBorders>
               <w:top w:val="single" w:color="BFC9D6" w:sz="4"/>
               <w:left w:val="single" w:color="BFC9D6" w:sz="4"/>
@@ -9247,7 +9247,7 @@
         </w:tc>
         <w:tc>
           <w:tcPr>
-            <w:tcW w:type="dxa" w:w="1979"/>
+            <w:tcW w:type="dxa" w:w="2334"/>
             <w:tcBorders>
               <w:top w:val="single" w:color="BFC9D6" w:sz="4"/>
               <w:left w:val="single" w:color="BFC9D6" w:sz="4"/>
@@ -9288,7 +9288,7 @@
         </w:trPr>
         <w:tc>
           <w:tcPr>
-            <w:tcW w:type="dxa" w:w="2078"/>
+            <w:tcW w:type="dxa" w:w="1960"/>
             <w:tcBorders>
               <w:top w:val="single" w:color="BFC9D6" w:sz="4"/>
               <w:left w:val="single" w:color="BFC9D6" w:sz="4"/>
@@ -9325,7 +9325,7 @@
         </w:tc>
         <w:tc>
           <w:tcPr>
-            <w:tcW w:type="dxa" w:w="973"/>
+            <w:tcW w:type="dxa" w:w="965"/>
             <w:tcBorders>
               <w:top w:val="single" w:color="BFC9D6" w:sz="4"/>
               <w:left w:val="single" w:color="BFC9D6" w:sz="4"/>
@@ -9362,7 +9362,7 @@
         </w:tc>
         <w:tc>
           <w:tcPr>
-            <w:tcW w:type="dxa" w:w="973"/>
+            <w:tcW w:type="dxa" w:w="965"/>
             <w:tcBorders>
               <w:top w:val="single" w:color="BFC9D6" w:sz="4"/>
               <w:left w:val="single" w:color="BFC9D6" w:sz="4"/>
@@ -9399,7 +9399,7 @@
         </w:tc>
         <w:tc>
           <w:tcPr>
-            <w:tcW w:type="dxa" w:w="2377"/>
+            <w:tcW w:type="dxa" w:w="2240"/>
             <w:tcBorders>
               <w:top w:val="single" w:color="BFC9D6" w:sz="4"/>
               <w:left w:val="single" w:color="BFC9D6" w:sz="4"/>
@@ -9436,7 +9436,7 @@
         </w:tc>
         <w:tc>
           <w:tcPr>
-            <w:tcW w:type="dxa" w:w="1484"/>
+            <w:tcW w:type="dxa" w:w="1400"/>
             <w:tcBorders>
               <w:top w:val="single" w:color="BFC9D6" w:sz="4"/>
               <w:left w:val="single" w:color="BFC9D6" w:sz="4"/>
@@ -9473,7 +9473,7 @@
         </w:tc>
         <w:tc>
           <w:tcPr>
-            <w:tcW w:type="dxa" w:w="1979"/>
+            <w:tcW w:type="dxa" w:w="2334"/>
             <w:tcBorders>
               <w:top w:val="single" w:color="BFC9D6" w:sz="4"/>
               <w:left w:val="single" w:color="BFC9D6" w:sz="4"/>
@@ -9515,7 +9515,7 @@
         </w:trPr>
         <w:tc>
           <w:tcPr>
-            <w:tcW w:type="dxa" w:w="2078"/>
+            <w:tcW w:type="dxa" w:w="1960"/>
             <w:tcBorders>
               <w:top w:val="single" w:color="BFC9D6" w:sz="4"/>
               <w:left w:val="single" w:color="BFC9D6" w:sz="4"/>
@@ -9551,7 +9551,7 @@
         </w:tc>
         <w:tc>
           <w:tcPr>
-            <w:tcW w:type="dxa" w:w="973"/>
+            <w:tcW w:type="dxa" w:w="965"/>
             <w:tcBorders>
               <w:top w:val="single" w:color="BFC9D6" w:sz="4"/>
               <w:left w:val="single" w:color="BFC9D6" w:sz="4"/>
@@ -9587,7 +9587,7 @@
         </w:tc>
         <w:tc>
           <w:tcPr>
-            <w:tcW w:type="dxa" w:w="973"/>
+            <w:tcW w:type="dxa" w:w="965"/>
             <w:tcBorders>
               <w:top w:val="single" w:color="BFC9D6" w:sz="4"/>
               <w:left w:val="single" w:color="BFC9D6" w:sz="4"/>
@@ -9623,7 +9623,7 @@
         </w:tc>
         <w:tc>
           <w:tcPr>
-            <w:tcW w:type="dxa" w:w="2377"/>
+            <w:tcW w:type="dxa" w:w="2240"/>
             <w:tcBorders>
               <w:top w:val="single" w:color="BFC9D6" w:sz="4"/>
               <w:left w:val="single" w:color="BFC9D6" w:sz="4"/>
@@ -9659,7 +9659,7 @@
         </w:tc>
         <w:tc>
           <w:tcPr>
-            <w:tcW w:type="dxa" w:w="1484"/>
+            <w:tcW w:type="dxa" w:w="1400"/>
             <w:tcBorders>
               <w:top w:val="single" w:color="BFC9D6" w:sz="4"/>
               <w:left w:val="single" w:color="BFC9D6" w:sz="4"/>
@@ -9695,7 +9695,7 @@
         </w:tc>
         <w:tc>
           <w:tcPr>
-            <w:tcW w:type="dxa" w:w="1979"/>
+            <w:tcW w:type="dxa" w:w="2334"/>
             <w:tcBorders>
               <w:top w:val="single" w:color="BFC9D6" w:sz="4"/>
               <w:left w:val="single" w:color="BFC9D6" w:sz="4"/>
@@ -9736,7 +9736,7 @@
         </w:trPr>
         <w:tc>
           <w:tcPr>
-            <w:tcW w:type="dxa" w:w="2078"/>
+            <w:tcW w:type="dxa" w:w="1960"/>
             <w:tcBorders>
               <w:top w:val="single" w:color="BFC9D6" w:sz="4"/>
               <w:left w:val="single" w:color="BFC9D6" w:sz="4"/>
@@ -9773,7 +9773,7 @@
         </w:tc>
         <w:tc>
           <w:tcPr>
-            <w:tcW w:type="dxa" w:w="973"/>
+            <w:tcW w:type="dxa" w:w="965"/>
             <w:tcBorders>
               <w:top w:val="single" w:color="BFC9D6" w:sz="4"/>
               <w:left w:val="single" w:color="BFC9D6" w:sz="4"/>
@@ -9810,7 +9810,7 @@
         </w:tc>
         <w:tc>
           <w:tcPr>
-            <w:tcW w:type="dxa" w:w="973"/>
+            <w:tcW w:type="dxa" w:w="965"/>
             <w:tcBorders>
               <w:top w:val="single" w:color="BFC9D6" w:sz="4"/>
               <w:left w:val="single" w:color="BFC9D6" w:sz="4"/>
@@ -9847,7 +9847,7 @@
         </w:tc>
         <w:tc>
           <w:tcPr>
-            <w:tcW w:type="dxa" w:w="2377"/>
+            <w:tcW w:type="dxa" w:w="2240"/>
             <w:tcBorders>
               <w:top w:val="single" w:color="BFC9D6" w:sz="4"/>
               <w:left w:val="single" w:color="BFC9D6" w:sz="4"/>
@@ -9884,7 +9884,7 @@
         </w:tc>
         <w:tc>
           <w:tcPr>
-            <w:tcW w:type="dxa" w:w="1484"/>
+            <w:tcW w:type="dxa" w:w="1400"/>
             <w:tcBorders>
               <w:top w:val="single" w:color="BFC9D6" w:sz="4"/>
               <w:left w:val="single" w:color="BFC9D6" w:sz="4"/>
@@ -9921,7 +9921,7 @@
         </w:tc>
         <w:tc>
           <w:tcPr>
-            <w:tcW w:type="dxa" w:w="1979"/>
+            <w:tcW w:type="dxa" w:w="2334"/>
             <w:tcBorders>
               <w:top w:val="single" w:color="BFC9D6" w:sz="4"/>
               <w:left w:val="single" w:color="BFC9D6" w:sz="4"/>
@@ -9963,7 +9963,7 @@
         </w:trPr>
         <w:tc>
           <w:tcPr>
-            <w:tcW w:type="dxa" w:w="2078"/>
+            <w:tcW w:type="dxa" w:w="1960"/>
             <w:tcBorders>
               <w:top w:val="single" w:color="BFC9D6" w:sz="4"/>
               <w:left w:val="single" w:color="BFC9D6" w:sz="4"/>
@@ -10009,7 +10009,7 @@
         </w:tc>
         <w:tc>
           <w:tcPr>
-            <w:tcW w:type="dxa" w:w="973"/>
+            <w:tcW w:type="dxa" w:w="965"/>
             <w:tcBorders>
               <w:top w:val="single" w:color="BFC9D6" w:sz="4"/>
               <w:left w:val="single" w:color="BFC9D6" w:sz="4"/>
@@ -10045,7 +10045,7 @@
         </w:tc>
         <w:tc>
           <w:tcPr>
-            <w:tcW w:type="dxa" w:w="973"/>
+            <w:tcW w:type="dxa" w:w="965"/>
             <w:tcBorders>
               <w:top w:val="single" w:color="BFC9D6" w:sz="4"/>
               <w:left w:val="single" w:color="BFC9D6" w:sz="4"/>
@@ -10081,7 +10081,7 @@
         </w:tc>
         <w:tc>
           <w:tcPr>
-            <w:tcW w:type="dxa" w:w="2377"/>
+            <w:tcW w:type="dxa" w:w="2240"/>
             <w:tcBorders>
               <w:top w:val="single" w:color="BFC9D6" w:sz="4"/>
               <w:left w:val="single" w:color="BFC9D6" w:sz="4"/>
@@ -10117,7 +10117,7 @@
         </w:tc>
         <w:tc>
           <w:tcPr>
-            <w:tcW w:type="dxa" w:w="1484"/>
+            <w:tcW w:type="dxa" w:w="1400"/>
             <w:tcBorders>
               <w:top w:val="single" w:color="BFC9D6" w:sz="4"/>
               <w:left w:val="single" w:color="BFC9D6" w:sz="4"/>
@@ -10153,7 +10153,7 @@
         </w:tc>
         <w:tc>
           <w:tcPr>
-            <w:tcW w:type="dxa" w:w="1979"/>
+            <w:tcW w:type="dxa" w:w="2334"/>
             <w:tcBorders>
               <w:top w:val="single" w:color="BFC9D6" w:sz="4"/>
               <w:left w:val="single" w:color="BFC9D6" w:sz="4"/>
@@ -10194,7 +10194,7 @@
         </w:trPr>
         <w:tc>
           <w:tcPr>
-            <w:tcW w:type="dxa" w:w="2078"/>
+            <w:tcW w:type="dxa" w:w="1960"/>
             <w:tcBorders>
               <w:top w:val="single" w:color="BFC9D6" w:sz="4"/>
               <w:left w:val="single" w:color="BFC9D6" w:sz="4"/>
@@ -10251,7 +10251,7 @@
         </w:tc>
         <w:tc>
           <w:tcPr>
-            <w:tcW w:type="dxa" w:w="973"/>
+            <w:tcW w:type="dxa" w:w="965"/>
             <w:tcBorders>
               <w:top w:val="single" w:color="BFC9D6" w:sz="4"/>
               <w:left w:val="single" w:color="BFC9D6" w:sz="4"/>
@@ -10288,7 +10288,7 @@
         </w:tc>
         <w:tc>
           <w:tcPr>
-            <w:tcW w:type="dxa" w:w="973"/>
+            <w:tcW w:type="dxa" w:w="965"/>
             <w:tcBorders>
               <w:top w:val="single" w:color="BFC9D6" w:sz="4"/>
               <w:left w:val="single" w:color="BFC9D6" w:sz="4"/>
@@ -10335,7 +10335,7 @@
         </w:tc>
         <w:tc>
           <w:tcPr>
-            <w:tcW w:type="dxa" w:w="2377"/>
+            <w:tcW w:type="dxa" w:w="2240"/>
             <w:tcBorders>
               <w:top w:val="single" w:color="BFC9D6" w:sz="4"/>
               <w:left w:val="single" w:color="BFC9D6" w:sz="4"/>
@@ -10420,7 +10420,7 @@
         </w:tc>
         <w:tc>
           <w:tcPr>
-            <w:tcW w:type="dxa" w:w="1484"/>
+            <w:tcW w:type="dxa" w:w="1400"/>
             <w:tcBorders>
               <w:top w:val="single" w:color="BFC9D6" w:sz="4"/>
               <w:left w:val="single" w:color="BFC9D6" w:sz="4"/>
@@ -10457,7 +10457,7 @@
         </w:tc>
         <w:tc>
           <w:tcPr>
-            <w:tcW w:type="dxa" w:w="1979"/>
+            <w:tcW w:type="dxa" w:w="2334"/>
             <w:tcBorders>
               <w:top w:val="single" w:color="BFC9D6" w:sz="4"/>
               <w:left w:val="single" w:color="BFC9D6" w:sz="4"/>
@@ -10489,6 +10489,299 @@
                 <w:rtl/>
               </w:rPr>
               <w:t xml:space="preserve">044_entry_guards.sql</w:t>
+            </w:r>
+          </w:p>
+        </w:tc>
+      </w:tr>
+      <w:tr>
+        <w:trPr>
+          <w:cantSplit/>
+        </w:trPr>
+        <w:tc>
+          <w:tcPr>
+            <w:tcW w:type="dxa" w:w="1960"/>
+            <w:tcBorders>
+              <w:top w:val="single" w:color="BFC9D6" w:sz="4"/>
+              <w:left w:val="single" w:color="BFC9D6" w:sz="4"/>
+              <w:bottom w:val="single" w:color="BFC9D6" w:sz="4"/>
+              <w:right w:val="single" w:color="BFC9D6" w:sz="4"/>
+            </w:tcBorders>
+            <w:tcMar>
+              <w:top w:type="dxa" w:w="50"/>
+              <w:left w:type="dxa" w:w="90"/>
+              <w:bottom w:type="dxa" w:w="50"/>
+              <w:right w:type="dxa" w:w="90"/>
+            </w:tcMar>
+            <w:vAlign w:val="top"/>
+          </w:tcPr>
+          <w:p>
+            <w:pPr>
+              <w:keepNext w:val="false"/>
+              <w:bidi/>
+              <w:spacing w:after="30" w:before="30" w:line="264"/>
+            </w:pPr>
+            <w:r>
+              <w:rPr>
+                <w:rFonts w:ascii="Arial" w:cs="Arial" w:eastAsia="Arial" w:hAnsi="Arial"/>
+                <w:b w:val="false"/>
+                <w:bCs w:val="false"/>
+                <w:sz w:val="18"/>
+                <w:szCs w:val="18"/>
+                <w:rtl/>
+              </w:rPr>
+              <w:t xml:space="preserve">JOB-FIN-READINESS (أُضيفت 2026-10-20، ADR 0027)</w:t>
+            </w:r>
+          </w:p>
+        </w:tc>
+        <w:tc>
+          <w:tcPr>
+            <w:tcW w:type="dxa" w:w="965"/>
+            <w:tcBorders>
+              <w:top w:val="single" w:color="BFC9D6" w:sz="4"/>
+              <w:left w:val="single" w:color="BFC9D6" w:sz="4"/>
+              <w:bottom w:val="single" w:color="BFC9D6" w:sz="4"/>
+              <w:right w:val="single" w:color="BFC9D6" w:sz="4"/>
+            </w:tcBorders>
+            <w:tcMar>
+              <w:top w:type="dxa" w:w="50"/>
+              <w:left w:type="dxa" w:w="90"/>
+              <w:bottom w:type="dxa" w:w="50"/>
+              <w:right w:type="dxa" w:w="90"/>
+            </w:tcMar>
+            <w:vAlign w:val="top"/>
+          </w:tcPr>
+          <w:p>
+            <w:pPr>
+              <w:keepNext w:val="false"/>
+              <w:bidi/>
+              <w:spacing w:after="30" w:before="30" w:line="264"/>
+            </w:pPr>
+            <w:r>
+              <w:rPr>
+                <w:rFonts w:ascii="Arial" w:cs="Arial" w:eastAsia="Arial" w:hAnsi="Arial"/>
+                <w:b w:val="false"/>
+                <w:bCs w:val="false"/>
+                <w:sz w:val="18"/>
+                <w:szCs w:val="18"/>
+                <w:rtl/>
+              </w:rPr>
+              <w:t xml:space="preserve">مشترك</w:t>
+            </w:r>
+          </w:p>
+        </w:tc>
+        <w:tc>
+          <w:tcPr>
+            <w:tcW w:type="dxa" w:w="965"/>
+            <w:tcBorders>
+              <w:top w:val="single" w:color="BFC9D6" w:sz="4"/>
+              <w:left w:val="single" w:color="BFC9D6" w:sz="4"/>
+              <w:bottom w:val="single" w:color="BFC9D6" w:sz="4"/>
+              <w:right w:val="single" w:color="BFC9D6" w:sz="4"/>
+            </w:tcBorders>
+            <w:tcMar>
+              <w:top w:type="dxa" w:w="50"/>
+              <w:left w:type="dxa" w:w="90"/>
+              <w:bottom w:type="dxa" w:w="50"/>
+              <w:right w:type="dxa" w:w="90"/>
+            </w:tcMar>
+            <w:vAlign w:val="top"/>
+          </w:tcPr>
+          <w:p>
+            <w:pPr>
+              <w:keepNext w:val="false"/>
+              <w:bidi/>
+              <w:spacing w:after="30" w:before="30" w:line="264"/>
+            </w:pPr>
+            <w:r>
+              <w:rPr>
+                <w:rFonts w:ascii="Arial" w:cs="Arial" w:eastAsia="Arial" w:hAnsi="Arial"/>
+                <w:b w:val="false"/>
+                <w:bCs w:val="false"/>
+                <w:sz w:val="18"/>
+                <w:szCs w:val="18"/>
+                <w:rtl/>
+              </w:rPr>
+              <w:t xml:space="preserve">05:20</w:t>
+            </w:r>
+          </w:p>
+        </w:tc>
+        <w:tc>
+          <w:tcPr>
+            <w:tcW w:type="dxa" w:w="2240"/>
+            <w:tcBorders>
+              <w:top w:val="single" w:color="BFC9D6" w:sz="4"/>
+              <w:left w:val="single" w:color="BFC9D6" w:sz="4"/>
+              <w:bottom w:val="single" w:color="BFC9D6" w:sz="4"/>
+              <w:right w:val="single" w:color="BFC9D6" w:sz="4"/>
+            </w:tcBorders>
+            <w:tcMar>
+              <w:top w:type="dxa" w:w="50"/>
+              <w:left w:type="dxa" w:w="90"/>
+              <w:bottom w:type="dxa" w:w="50"/>
+              <w:right w:type="dxa" w:w="90"/>
+            </w:tcMar>
+            <w:vAlign w:val="top"/>
+          </w:tcPr>
+          <w:p>
+            <w:pPr>
+              <w:keepNext w:val="false"/>
+              <w:bidi/>
+              <w:spacing w:after="30" w:before="30" w:line="264"/>
+            </w:pPr>
+            <w:r>
+              <w:rPr>
+                <w:rFonts w:ascii="Arial" w:cs="Arial" w:eastAsia="Arial" w:hAnsi="Arial"/>
+                <w:b w:val="false"/>
+                <w:bCs w:val="false"/>
+                <w:sz w:val="18"/>
+                <w:szCs w:val="18"/>
+                <w:rtl/>
+              </w:rPr>
+              <w:t xml:space="preserve">الإنذار المبكر: </w:t>
+            </w:r>
+            <w:r>
+              <w:rPr>
+                <w:rFonts w:ascii="Courier New" w:cs="Courier New" w:eastAsia="Courier New" w:hAnsi="Courier New"/>
+                <w:b w:val="false"/>
+                <w:bCs w:val="false"/>
+                <w:color w:val="1F2937"/>
+                <w:sz w:val="16"/>
+                <w:szCs w:val="16"/>
+                <w:shd w:fill="F1F3F5" w:color="auto" w:val="clear"/>
+                <w:rtl/>
+              </w:rPr>
+              <w:t xml:space="preserve">‎fin.usp_RunEarlyWarnings‎</w:t>
+            </w:r>
+            <w:r>
+              <w:rPr>
+                <w:rFonts w:ascii="Arial" w:cs="Arial" w:eastAsia="Arial" w:hAnsi="Arial"/>
+                <w:b w:val="false"/>
+                <w:bCs w:val="false"/>
+                <w:sz w:val="18"/>
+                <w:szCs w:val="18"/>
+                <w:rtl/>
+              </w:rPr>
+              <w:t xml:space="preserve"> يكتب </w:t>
+            </w:r>
+            <w:r>
+              <w:rPr>
+                <w:rFonts w:ascii="Courier New" w:cs="Courier New" w:eastAsia="Courier New" w:hAnsi="Courier New"/>
+                <w:b w:val="false"/>
+                <w:bCs w:val="false"/>
+                <w:color w:val="1F2937"/>
+                <w:sz w:val="16"/>
+                <w:szCs w:val="16"/>
+                <w:shd w:fill="F1F3F5" w:color="auto" w:val="clear"/>
+                <w:rtl/>
+              </w:rPr>
+              <w:t xml:space="preserve">‎fin.EarlyWarningAlert‎</w:t>
+            </w:r>
+            <w:r>
+              <w:rPr>
+                <w:rFonts w:ascii="Arial" w:cs="Arial" w:eastAsia="Arial" w:hAnsi="Arial"/>
+                <w:b w:val="false"/>
+                <w:bCs w:val="false"/>
+                <w:sz w:val="18"/>
+                <w:szCs w:val="18"/>
+                <w:rtl/>
+              </w:rPr>
+              <w:t xml:space="preserve"> وصف </w:t>
+            </w:r>
+            <w:r>
+              <w:rPr>
+                <w:rFonts w:ascii="Courier New" w:cs="Courier New" w:eastAsia="Courier New" w:hAnsi="Courier New"/>
+                <w:b w:val="false"/>
+                <w:bCs w:val="false"/>
+                <w:color w:val="1F2937"/>
+                <w:sz w:val="16"/>
+                <w:szCs w:val="16"/>
+                <w:shd w:fill="F1F3F5" w:color="auto" w:val="clear"/>
+                <w:rtl/>
+              </w:rPr>
+              <w:t xml:space="preserve">‎notification.requested‎</w:t>
+            </w:r>
+            <w:r>
+              <w:rPr>
+                <w:rFonts w:ascii="Arial" w:cs="Arial" w:eastAsia="Arial" w:hAnsi="Arial"/>
+                <w:b w:val="false"/>
+                <w:bCs w:val="false"/>
+                <w:sz w:val="18"/>
+                <w:szCs w:val="18"/>
+                <w:rtl/>
+              </w:rPr>
+              <w:t xml:space="preserve"> بالحدث FIN.READINESS_WARNING في معاملة واحدة</w:t>
+            </w:r>
+          </w:p>
+        </w:tc>
+        <w:tc>
+          <w:tcPr>
+            <w:tcW w:type="dxa" w:w="1400"/>
+            <w:tcBorders>
+              <w:top w:val="single" w:color="BFC9D6" w:sz="4"/>
+              <w:left w:val="single" w:color="BFC9D6" w:sz="4"/>
+              <w:bottom w:val="single" w:color="BFC9D6" w:sz="4"/>
+              <w:right w:val="single" w:color="BFC9D6" w:sz="4"/>
+            </w:tcBorders>
+            <w:tcMar>
+              <w:top w:type="dxa" w:w="50"/>
+              <w:left w:type="dxa" w:w="90"/>
+              <w:bottom w:type="dxa" w:w="50"/>
+              <w:right w:type="dxa" w:w="90"/>
+            </w:tcMar>
+            <w:vAlign w:val="top"/>
+          </w:tcPr>
+          <w:p>
+            <w:pPr>
+              <w:keepNext w:val="false"/>
+              <w:bidi/>
+              <w:spacing w:after="30" w:before="30" w:line="264"/>
+            </w:pPr>
+            <w:r>
+              <w:rPr>
+                <w:rFonts w:ascii="Arial" w:cs="Arial" w:eastAsia="Arial" w:hAnsi="Arial"/>
+                <w:b w:val="false"/>
+                <w:bCs w:val="false"/>
+                <w:sz w:val="18"/>
+                <w:szCs w:val="18"/>
+                <w:rtl/>
+              </w:rPr>
+              <w:t xml:space="preserve">(الشركة، نوع الموعد، المرجع، التاريخ، المرحلة، الجاهزية)</w:t>
+            </w:r>
+          </w:p>
+        </w:tc>
+        <w:tc>
+          <w:tcPr>
+            <w:tcW w:type="dxa" w:w="2334"/>
+            <w:tcBorders>
+              <w:top w:val="single" w:color="BFC9D6" w:sz="4"/>
+              <w:left w:val="single" w:color="BFC9D6" w:sz="4"/>
+              <w:bottom w:val="single" w:color="BFC9D6" w:sz="4"/>
+              <w:right w:val="single" w:color="BFC9D6" w:sz="4"/>
+            </w:tcBorders>
+            <w:tcMar>
+              <w:top w:type="dxa" w:w="50"/>
+              <w:left w:type="dxa" w:w="90"/>
+              <w:bottom w:type="dxa" w:w="50"/>
+              <w:right w:type="dxa" w:w="90"/>
+            </w:tcMar>
+            <w:vAlign w:val="top"/>
+          </w:tcPr>
+          <w:p>
+            <w:pPr>
+              <w:keepNext w:val="false"/>
+              <w:bidi/>
+              <w:spacing w:after="30" w:before="30" w:line="264"/>
+            </w:pPr>
+            <w:r>
+              <w:rPr>
+                <w:rFonts w:ascii="Arial" w:cs="Arial" w:eastAsia="Arial" w:hAnsi="Arial"/>
+                <w:b w:val="false"/>
+                <w:bCs w:val="false"/>
+                <w:sz w:val="18"/>
+                <w:szCs w:val="18"/>
+                <w:rtl/>
+              </w:rPr>
+              <w:t xml:space="preserve">051_early_warning_job.sql</w:t>
             </w:r>
           </w:p>
         </w:tc>
@@ -10602,7 +10895,7 @@
       <w:r>
         <w:drawing>
           <wp:inline distT="0" distB="0" distL="0" distR="0">
-            <wp:extent cx="1647825" cy="8191500"/>
+            <wp:extent cx="1485900" cy="8191500"/>
             <wp:effectExtent t="0" r="0" b="0" l="0"/>
             <wp:docPr id="1" name="diagram-3.png" descr="" title=""/>
             <wp:cNvGraphicFramePr>
@@ -10627,7 +10920,7 @@
                   <pic:spPr bwMode="auto">
                     <a:xfrm>
                       <a:off x="0" y="0"/>
-                      <a:ext cx="1647825" cy="8191500"/>
+                      <a:ext cx="1485900" cy="8191500"/>
                     </a:xfrm>
                     <a:prstGeom prst="rect">
                       <a:avLst/>

</xml_diff>